<commit_message>
Clarify restart, victory, and navigation ownership
- add a shared Floor Run/Restart Orchestrator for full run-state reset ownership
- require persistent gameplay systems to expose owned reset interfaces
- clarify that early prototype restart support is staged and does not complete the full reset requirement
- define the door-to-navigation passability ownership boundary
- keep semantic door state owned by Door and Interaction
- keep enemy walkability translation owned by the shared navigation layer
- add explicit final-victory behavior with input stop and a simple "You Escaped" overlay
- make minimal-context agent dispatch an explicit pipeline constraint
- harden reconciliation to preserve restart, victory, passability, and dispatch requirements
- harden coverage, structure, and refiner prompts around the new ownership rules
- preserve the existing formatted GDD layout while updating the canonical Markdown and Word documents
</commit_message>
<xml_diff>
--- a/Docs/GDD/No_Safe_Circle_GDD_Final.docx
+++ b/Docs/GDD/No_Safe_Circle_GDD_Final.docx
@@ -20,7 +20,7 @@
     </w:p>
     <w:p>
       <w:r>
-        <w:t>Working Title | Final Draft | Originally July 21, 2026; revised August 19, 2026 | Vincent Liguori</w:t>
+        <w:t>Working Title | Final Draft | Originally July 21, 2026; revised August 20, 2026 | Vincent Liguori</w:t>
       </w:r>
     </w:p>
     <w:p>
@@ -940,15 +940,10 @@
         <w:t>Win:</w:t>
       </w:r>
       <w:r>
-        <w:t xml:space="preserve"> Open the final door and escape the dungeon.</w:t>
-      </w:r>
-    </w:p>
-    <w:p>
-      <w:r>
-        <w:rPr>
-          <w:b/>
-        </w:rPr>
-      </w:r>
+        <w:t xml:space="preserve"> Open the final door and escape the dungeon. Victory occurs when the shared doorway-crossing state confirms that the wizard has crossed to the forward side of the final door; the win condition does not implement a separate crossing detector. Once victory is confirmed, normal gameplay input stops and a simple player-facing You Escaped overlay is displayed. No additional post-victory progression, menu flow, or meta-progression is required for the capstone.</w:t>
+      </w:r>
+    </w:p>
+    <w:p>
       <w:r>
         <w:rPr>
           <w:b/>
@@ -956,10 +951,19 @@
         <w:t>Loss:</w:t>
       </w:r>
       <w:r>
+        <w:t xml:space="preserve"> Reach zero health. The floor then restarts from the beginning. This is an intentional, single-attempt structure — reaching zero health at any point restarts the entire floor by design, not as a placeholder. Restart resets all run-persistent gameplay state to the floor's initial state, including player resources/cooldowns, persistent enemy objects and enemy health, pursuit/search state, Active Enemy Registry bookkeeping, door lifecycle/crossing state, encounter activation state, and player position.</w:t>
+      </w:r>
+    </w:p>
+    <w:p>
+      <w:pPr/>
+      <w:r>
         <w:rPr>
-          <w:b w:val="0"/>
+          <w:b/>
         </w:rPr>
-        <w:t xml:space="preserve"> Reach zero health. The floor then restarts from the beginning. This is an intentional, single-attempt structure — reaching zero health at any point restarts the entire floor by design, not as a placeholder. Restart resets all run-persistent gameplay state to the floor's initial state, including player resources/cooldowns, persistent enemy objects and enemy health, pursuit/search state, Active Enemy Registry bookkeeping, door lifecycle/crossing state, encounter activation state, and player position. Early implementation may validate this against the persistent systems that currently exist, but the reset contract must remain extensible to later rooms without redesign.</w:t>
+        <w:t>Floor-run restart ownership:</w:t>
+      </w:r>
+      <w:r>
+        <w:t xml:space="preserve"> A shared Floor Run/Restart Orchestrator owns starting a fresh floor attempt and coordinating the reset. It does not reach into or duplicate another system's internal state. Every system that owns run-persistent state must expose a reset entry point for the state it owns, and the orchestrator invokes those owned reset interfaces. Required reset participants include Player Health, Player Mana/cooldowns, player position, enemy health/defeat state, enemy pursuit/search state, Active Enemy Registry bookkeeping, door lifecycle/crossing/durability state, and encounter activation/admission state. Early implementation may validate the orchestrator against only the persistent systems that currently exist, but full restart closure remains required work until every implemented run-persistent owner participates; adding later rooms or persistent systems must extend the reset participants without redesigning the orchestration contract.</w:t>
       </w:r>
     </w:p>
     <w:p>
@@ -1450,6 +1454,14 @@
       </w:pPr>
       <w:r>
         <w:t>The Door and Interaction system owns doorway-crossing state. After a door is open, it detects when the wizard has actually crossed to that door's forward side and exposes that state to consumers. Opening a door does not by itself count as crossing. Door locking and the final escape condition consume this same crossing state rather than implementing separate crossing detectors.</w:t>
+      </w:r>
+    </w:p>
+    <w:p>
+      <w:pPr>
+        <w:pStyle w:val="ListBullet"/>
+      </w:pPr>
+      <w:r>
+        <w:t>Door passability contract: Door and Interaction owns the semantic door state (sealed, open, locked, broken). The shared gameplay navigation/locomotion layer owns translating that semantic state into enemy walkability through a shared passability interface. Sealed and locked doors block enemy traversal; open and broken doors permit forward enemy traversal. Door state changes update the navigation layer through that interface, while enemy pursuit/attack code does not independently manipulate NavMesh or doorway passability. The exact Unity mechanism used beneath this interface (for example obstacle/carving, a navigation link, or runtime navigation-data update) is an implementation choice rather than a separate game-design decision.</w:t>
       </w:r>
     </w:p>
     <w:p>
@@ -2025,7 +2037,7 @@
         <w:pStyle w:val="ListBullet"/>
       </w:pPr>
       <w:r>
-        <w:t>Enemy Pursuit Agent owns enemy pursuit/search state, enemy locomotion behavior, enemy attack behavior, Frost slowdown application/restoration, forced displacement, and shared Active Enemy Registry bookkeeping. Enemy attacks consume the shared Player Health damage interface, enemy locomotion consumes the shared gameplay navigation/locomotion layer, and encounter activation consumes the registry rather than maintaining a separate count.</w:t>
+        <w:t>Enemy Pursuit Agent owns enemy pursuit/search state, enemy locomotion behavior, enemy attack behavior, Frost slowdown application/restoration, forced displacement, and shared Active Enemy Registry bookkeeping. Enemy attacks consume the shared Player Health damage interface, enemy locomotion consumes the shared gameplay navigation/locomotion layer, and encounter activation consumes the registry rather than maintaining a separate count. Pursuit and attack behavior consume doorway walkability from the shared navigation layer rather than directly changing NavMesh or door passability.</w:t>
       </w:r>
     </w:p>
     <w:p>
@@ -2033,7 +2045,7 @@
         <w:pStyle w:val="ListBullet"/>
       </w:pPr>
       <w:r>
-        <w:t>Door and Interaction Agent owns door targeting, the latched opening interaction, shared doorway-crossing state, and door lifecycle state. Other systems consume doorway-crossing state rather than implementing their own crossing detector.</w:t>
+        <w:t>Door and Interaction Agent owns door targeting, the latched opening interaction, shared doorway-crossing state, and semantic door lifecycle state. Other systems consume doorway-crossing state rather than implementing their own crossing detector. Door state changes are published through the shared navigation/locomotion passability interface; Door and Interaction does not own the navigation technology that translates those states into enemy walkability.</w:t>
       </w:r>
     </w:p>
     <w:p>
@@ -2129,7 +2141,7 @@
         </w:rPr>
       </w:pPr>
       <w:r>
-        <w:t>Agents receive only the approved feature brief, acceptance criteria, relevant files, and necessary scene or prefab information.</w:t>
+        <w:t>Minimal-context dispatch is a required pipeline constraint: agents receive only the approved feature brief, its acceptance criteria, the relevant GDD rules, and the files plus scene/prefab information required for the active task. Unrelated project files or broad project context are not included unless the task genuinely requires them.</w:t>
       </w:r>
     </w:p>
     <w:p>
@@ -2385,7 +2397,7 @@
         <w:pStyle w:val="ListBullet"/>
       </w:pPr>
       <w:r>
-        <w:t>A shared gameplay navigation/locomotion layer owns the walkable movement representation and the navigation-facing configuration used by runtime movers. Enemy pursuit/search, melee/ranged behavior, status effects, and forced displacement consume this layer instead of each selecting or configuring navigation technology independently.</w:t>
+        <w:t>A shared gameplay navigation/locomotion layer owns the walkable movement representation and the navigation-facing configuration used by runtime movers. It also owns the navigation-side implementation of the shared door-passability interface: semantic door state is supplied by Door and Interaction, while this layer translates sealed/open/locked/broken state into enemy walkability. Enemy pursuit/search, melee/ranged behavior, status effects, and forced displacement consume this layer instead of each selecting or configuring navigation technology or doorway passability independently.</w:t>
       </w:r>
     </w:p>
     <w:p>
@@ -2524,16 +2536,8 @@
       <w:pPr>
         <w:pStyle w:val="ListBullet"/>
       </w:pPr>
-      <w:proofErr w:type="gramStart"/>
-      <w:proofErr w:type="gramEnd"/>
-      <w:proofErr w:type="gramStart"/>
-      <w:proofErr w:type="gramEnd"/>
-      <w:r/>
-      <w:r>
-        <w:rPr>
-          <w:b w:val="0"/>
-        </w:rPr>
-        <w:t>A shared gameplay navigation/locomotion layer provides the walkable movement representation and navigation-facing configuration consumed by enemy movement. The approved implementation uses Unity AI Navigation (com.unity.ai.navigation) and NavMesh-based runtime movement; enemy detection/pursuit/search logic does not choose or configure a different navigation technology independently. Once that shared navigation layer exists, finite-state components control pursuit, attacks, target loss, search, and reacquisition across the floor's spaces. Enemies acquire the player inside Detection Distance and use a larger Lose Target Distance to end exact pursuit. Exceeding Lose Target Distance transitions the enemy to the player's last known position, followed by a short bounded randomized search/wander if the player is not immediately reacquired; doorway crossing alone does not clear pursuit. Exact distance thresholds, search duration, and random search weighting are playtesting values. Ranged Enemy attacks include a line-of-sight/occlusion check, and Bone Archive's lane widths are validated against enemy movement/navigation requirements so both rooms' stated tactical geometry holds in practice.</w:t>
+      <w:r>
+        <w:t>A shared gameplay navigation/locomotion layer provides the walkable movement representation and navigation-facing configuration consumed by enemy movement. The approved implementation uses Unity AI Navigation (com.unity.ai.navigation) and NavMesh-based runtime movement; enemy detection/pursuit/search logic does not choose or configure a different navigation technology independently. The same layer exposes the navigation side of the shared door-passability interface and translates Door and Interaction's semantic sealed/open/locked/broken state into enemy walkability. Once that shared navigation layer exists, finite-state components control pursuit, attacks, target loss, search, and reacquisition across the floor's spaces. Enemies acquire the player inside Detection Distance and use a larger Lose Target Distance to end exact pursuit. Exceeding Lose Target Distance transitions the enemy to the player's last known position, followed by a short bounded randomized search/wander if the player is not immediately reacquired; doorway crossing alone does not clear pursuit. Exact distance thresholds, search duration, random search weighting, and the underlying Unity mechanism used to update doorway passability are implementation/playtesting details beneath the approved shared contracts. Ranged Enemy attacks include a line-of-sight/occlusion check, and Bone Archive's lane widths are validated against enemy movement/navigation requirements so both rooms' stated tactical geometry holds in practice.</w:t>
       </w:r>
     </w:p>
     <w:p>
@@ -2578,6 +2582,14 @@
       </w:pPr>
       <w:r>
         <w:t>A reusable door component will control opening, interruption, shared doorway-crossing state, closing, locking, damage, and breaking. It records when the wizard crosses to the forward side of an opened door and exposes that state to locking and final-victory logic; those consumers do not implement separate crossing detection. Once a door is locked by the player or broken by enemies, it does not return to an earlier state.</w:t>
+      </w:r>
+    </w:p>
+    <w:p>
+      <w:pPr>
+        <w:pStyle w:val="ListBullet"/>
+      </w:pPr>
+      <w:r>
+        <w:t>A shared Floor Run/Restart Orchestrator coordinates a new floor attempt when player health reaches zero. It invokes reset entry points owned by each run-persistent system rather than directly mutating their internals. Player resources/position, enemy health and pursuit/search state, Active Enemy Registry bookkeeping, door lifecycle/crossing/durability state, and encounter activation/admission state must all participate once those systems exist. Early staged restart implementation is valid only as an incremental step; the persistent-systems closure remains required until all implemented run-persistent owners are connected to the orchestrator.</w:t>
       </w:r>
     </w:p>
     <w:p>
@@ -2871,7 +2883,7 @@
         <w:pStyle w:val="ListBullet"/>
       </w:pPr>
       <w:r>
-        <w:t>Agents receive only the approved feature brief, relevant GDD rules, and files required for the active task.</w:t>
+        <w:t>Minimal-context dispatch is mandatory: agents receive only the approved feature brief, its acceptance criteria, relevant GDD rules, and files plus scene/prefab information required for the active task. Unrelated repository context is withheld unless the active task requires it.</w:t>
       </w:r>
     </w:p>
     <w:p>

</xml_diff>

<commit_message>
Close verification ownership and process gaps
- clarify that Player Health owns both damage and health restoration
- require door locking to restore health through the Player Health interface
- make door lifecycle depend on the shared navigation owner when publishing passability changes
- clarify that exclusive-resource locking does not replace a real dependency
- represent failed-task retry behavior as a required pipeline constraint
- represent player-experience success criteria as validation requirements on the owning work
- harden reconciliation and verification around the remaining ownership and representation rules
- audit shared Input Actions locking where tasks modify the asset
- enforce AgentCrew and DynamicContentPipeline source exclusions at the Claude tool-permission level
- extend the verification smoke test to assert the hard source-boundary configuration
- preserve the existing formatted GDD while updating canonical Markdown and Word sources
</commit_message>
<xml_diff>
--- a/Docs/GDD/No_Safe_Circle_GDD_Final.docx
+++ b/Docs/GDD/No_Safe_Circle_GDD_Final.docx
@@ -878,6 +878,14 @@
         <w:pStyle w:val="ListBullet"/>
       </w:pPr>
       <w:r>
+        <w:t>Player Health ownership: The shared Player Health system is the single owner of the wizard's current health. It exposes owner-controlled damage and restore interfaces. Door locking requests the fixed recovery through the Player Health restore interface; restoration is clamped to maximum health, and Door and Interaction never writes player-health state directly.</w:t>
+      </w:r>
+    </w:p>
+    <w:p>
+      <w:pPr>
+        <w:pStyle w:val="ListBullet"/>
+      </w:pPr>
+      <w:r>
         <w:t>Health feedback: The wizard's current health is continuously visible through a simple player-facing health indicator. Because damage persists across rooms, the player must be able to read accumulated damage and remaining survivability throughout the run.</w:t>
       </w:r>
     </w:p>
@@ -1732,7 +1740,7 @@
     </w:p>
     <w:p>
       <w:r>
-        <w:t>Peer feedback identified that the earlier draft did not explain how the spells and room layouts produced different tactical decisions. A targeted multi-agent review then tested whether those decisions could collapse into a dominant strategy. This revision clarifies Fireball's tap-versus-charge tradeoff, Frost Field's resource commitment, Force Wave's mid-room-versus-door decision, mixed enemy compositions, persistent-pursuer priority, room-specific implementation checks, distance-based target loss and search behavior, accessible cursor-targeted door interaction, shared doorway-crossing ownership, enemy damage through Player Health, active-enemy bookkeeping, runtime ownership boundaries, visible health feedback, character SpriteRenderer ownership, approved Unity package choices, Windows build configuration ownership, and full-run restart state without expanding the required content scope.</w:t>
+        <w:t>Peer feedback identified that the earlier draft did not explain how the spells and room layouts produced different tactical decisions. A targeted multi-agent review then tested whether those decisions could collapse into a dominant strategy. This revision clarifies Fireball's tap-versus-charge tradeoff, Frost Field's resource commitment, Force Wave's mid-room-versus-door decision, mixed enemy compositions, persistent-pursuer priority, room-specific implementation checks, distance-based target loss and search behavior, accessible cursor-targeted door interaction, shared doorway-crossing ownership, enemy damage through Player Health, active-enemy bookkeeping, runtime ownership boundaries, Player Health restoration ownership, door-to-navigation passability prerequisites, player-experience validation obligations, visible health feedback, character SpriteRenderer ownership, approved Unity package choices, Windows build configuration ownership, failed-task retry policy, and full-run restart state without expanding the required content scope.</w:t>
       </w:r>
     </w:p>
     <w:p>
@@ -2053,6 +2061,14 @@
         <w:pStyle w:val="ListBullet"/>
       </w:pPr>
       <w:r>
+        <w:t>Door/navigation integration prerequisite: the navigation-owned shared passability interface must exist before door-state publication through that interface is dispatch-ready. Door lifecycle work that does not require navigation may be decomposed and implemented earlier, but if passability publication remains bundled inside one executable door-lifecycle item, that item depends on the gameplay navigation/locomotion owner. An exclusive-resource lock is not a substitute for this behavioral dependency.</w:t>
+      </w:r>
+    </w:p>
+    <w:p>
+      <w:pPr>
+        <w:pStyle w:val="ListBullet"/>
+      </w:pPr>
+      <w:r>
         <w:t>Dungeon Encounter Agent owns encounter content/activation policy and consumes the shared Active Enemy Registry when admitting new enemies; it does not replace or remove existing persistent pursuers to satisfy the cap.</w:t>
       </w:r>
     </w:p>
@@ -2062,6 +2078,14 @@
       </w:pPr>
       <w:r>
         <w:t>Unity Validation Agent verifies integrated behavior and ownership boundaries but does not redefine runtime ownership or silently implement missing gameplay responsibilities.</w:t>
+      </w:r>
+    </w:p>
+    <w:p>
+      <w:pPr>
+        <w:pStyle w:val="ListBullet"/>
+      </w:pPr>
+      <w:r>
+        <w:t>Player Experience Success Criteria are required validation obligations, not advisory prose. Each criterion in Section 3 must be represented as a validation requirement on the work item or items that own the underlying behavior. They do not require separate gameplay features when the behavior is already owned.</w:t>
       </w:r>
     </w:p>
     <w:p>
@@ -2811,7 +2835,7 @@
     </w:tbl>
     <w:p>
       <w:r>
-        <w:t>If a task fails, its scope and context will be reduced before it is attempted again. The entire project will not be repeatedly submitted to an agent for a single bug.</w:t>
+        <w:t>Failed-task retry policy is a required pipeline constraint: If a task fails, its scope and context will be reduced before it is attempted again. The entire project will not be repeatedly submitted to an agent for a single bug.</w:t>
       </w:r>
     </w:p>
     <w:p>

</xml_diff>

<commit_message>
Harden verification semantics and coverage
- clarify Force Wave as player-centered radial knockback with no cursor targeting
- add required_implementation coverage taxonomy for technical/configuration requirements
- allow package and architecture requirements to map to implementation work
- harden reconciliation for door reset participation and restart closure
- restore player-health persistence and zero-health signaling requirements
- restore melee closing-distance behavior
- preserve door breach feedback and spell mana-interface requirements
- harden verification around scene-path and camera/world-foundation integration semantics
- avoid treating implementation/integration questions as GDD ambiguities
- update reconciliation and refiner guidance for the latest canonical ownership rules
- preserve formatted GDD layout and existing source-boundary protections
</commit_message>
<xml_diff>
--- a/Docs/GDD/No_Safe_Circle_GDD_Final.docx
+++ b/Docs/GDD/No_Safe_Circle_GDD_Final.docx
@@ -483,7 +483,7 @@
           </w:tcPr>
           <w:p>
             <w:r>
-              <w:t>Use mouse-directed movement: click to set a destination or hold to keep steering toward the cursor. The cursor also serves as the aiming and targeting reference for spells and cursor-targeted interactions such as sealed doors.</w:t>
+              <w:t>Use mouse-directed movement: click to set a destination or hold to keep steering toward the cursor. The cursor serves as the aiming and targeting reference for cursor-aimed spells and cursor-targeted interactions such as sealed doors; Force Wave is the exception and is centered on the wizard.</w:t>
             </w:r>
           </w:p>
         </w:tc>
@@ -582,7 +582,7 @@
           </w:tcPr>
           <w:p>
             <w:r>
-              <w:t>Use a short-range radial knockback with a long cooldown.</w:t>
+              <w:t>Use a player-centered short-range radial knockback with a long cooldown. Force Wave does not use cursor direction or target selection.</w:t>
             </w:r>
           </w:p>
         </w:tc>
@@ -2549,12 +2549,9 @@
         <w:pStyle w:val="ListBullet"/>
       </w:pPr>
       <w:r>
-        <w:t xml:space="preserve">Player movement uses mouse-directed click/hold navigation over the gameplay plane. The cursor is also the primary targeting reference for spells and interactions, aligning movement and </w:t>
-      </w:r>
-      <w:r>
-        <w:lastRenderedPageBreak/>
-        <w:t>combat with the isometric presentation. Sealed doors require cursor targeting plus arm’s-reach proximity to begin interaction; once the five-second hold has begun, the selected door remains latched and cursor movement off the door does not cancel the attempt.</w:t>
-      </w:r>
+        <w:t>Player movement uses mouse-directed click/hold navigation over the gameplay plane. The cursor is the primary targeting reference for cursor-aimed spells and interactions, aligning movement and combat with the isometric presentation; Force Wave is the player-centered radial exception and does not use cursor direction or target selection. Sealed doors require cursor targeting plus arm’s-reach proximity to begin interaction; once the five-second hold has begun, the selected door remains latched and cursor movement off the door does not cancel the attempt.</w:t>
+      </w:r>
+      <w:r/>
     </w:p>
     <w:p>
       <w:pPr>

</xml_diff>

<commit_message>
Gdd Changes, merged reconcile gdd content into gdd
</commit_message>
<xml_diff>
--- a/Docs/GDD/No_Safe_Circle_GDD_Final.docx
+++ b/Docs/GDD/No_Safe_Circle_GDD_Final.docx
@@ -518,7 +518,7 @@
           </w:tcPr>
           <w:p>
             <w:r>
-              <w:t>Tap for a quick, mobile shot against a single or separated enemy. Hold to charge: costs more mana and restricts movement further, rewarding preparation by damaging multiple clustered enemies.</w:t>
+              <w:t>Aim with the cursor. Tap for a quick, mobile shot against a single or separated enemy. Hold to charge: costs more mana and restricts movement further, rewarding preparation by damaging multiple clustered enemies.</w:t>
             </w:r>
           </w:p>
         </w:tc>
@@ -878,7 +878,7 @@
         <w:pStyle w:val="ListBullet"/>
       </w:pPr>
       <w:r>
-        <w:t>Player Health ownership: The shared Player Health system is the single owner of the wizard's current health. It exposes owner-controlled damage and restore interfaces. Door locking requests the fixed recovery through the Player Health restore interface; restoration is clamped to maximum health, and Door and Interaction never writes player-health state directly.</w:t>
+        <w:t>Player Health ownership: The shared Player Health system is the single owner of the wizard's current health. It exposes owner-controlled damage and restore interfaces plus an observable zero-health/death transition consumed by the Floor Run/Restart Orchestrator. Door locking requests the fixed recovery through the Player Health restore interface; restoration is clamped to maximum health, and Door and Interaction never writes player-health state directly. The restart orchestrator consumes the zero-health transition rather than polling or mutating Player Health internals.</w:t>
       </w:r>
     </w:p>
     <w:p>
@@ -902,6 +902,14 @@
         <w:pStyle w:val="ListBullet"/>
       </w:pPr>
       <w:r>
+        <w:t>Player Mana ownership: The shared Player Mana system is the single owner of current mana and the post-cast regeneration-delay state. Spells spend mana through its owner-controlled spend interface. Player Mana does not own spell-local cooldown, charge, cast, placement, or active-effect state merely because those spells consume mana.</w:t>
+      </w:r>
+    </w:p>
+    <w:p>
+      <w:pPr>
+        <w:pStyle w:val="ListBullet"/>
+      </w:pPr>
+      <w:r>
         <w:t>Movement: Circling or retreating creates temporary separation from pursuers, but Melee Enemies gradually close the distance over time; movement alone cannot preserve a completely safe distance indefinitely in later encounters. Sustaining real separation requires turning routes, obstacles, Frost Field, Force Wave, or reducing the threat directly.</w:t>
       </w:r>
     </w:p>
@@ -910,7 +918,31 @@
         <w:pStyle w:val="ListBullet"/>
       </w:pPr>
       <w:r>
+        <w:t>Player Movement ownership: The player movement system owns player position, locomotion, and movement-restriction state. Charged Fireball requests and releases its charging movement restriction through an owner-controlled Player Movement interface; Fireball does not directly mutate movement internals.</w:t>
+      </w:r>
+    </w:p>
+    <w:p>
+      <w:pPr>
+        <w:pStyle w:val="ListBullet"/>
+      </w:pPr>
+      <w:r>
+        <w:t>Frost Field feedback: The Frost Field cast and active field provide player-facing feedback that makes the effect readable while it is being placed/used. The exact visual or audio treatment is an implementation choice.</w:t>
+      </w:r>
+    </w:p>
+    <w:p>
+      <w:pPr>
+        <w:pStyle w:val="ListBullet"/>
+      </w:pPr>
+      <w:r>
         <w:t>Force Wave: A visible long cooldown shows when the emergency escape tool is unavailable.</w:t>
+      </w:r>
+    </w:p>
+    <w:p>
+      <w:pPr>
+        <w:pStyle w:val="ListBullet"/>
+      </w:pPr>
+      <w:r>
+        <w:t>Spell-local state ownership: Fireball owns its tap/charge/cast state, Frost Field owns its Wizard-Combat-side cast/placement/active-field state, and Force Wave owns its cooldown state. Enemy-side Frost slowdown application/restoration remains owned by Enemy Pursuit/status-effect logic. Each owner exposes a reset entry point for any owned state that can still be active when a floor restart occurs.</w:t>
       </w:r>
     </w:p>
     <w:p>
@@ -945,22 +977,18 @@
         <w:rPr>
           <w:b/>
         </w:rPr>
-        <w:t>Win:</w:t>
-      </w:r>
-      <w:r>
-        <w:t xml:space="preserve"> Open the final door and escape the dungeon. Victory occurs when the shared doorway-crossing state confirms that the wizard has crossed to the forward side of the final door; the win condition does not implement a separate crossing detector. Once victory is confirmed, normal gameplay input stops and a simple player-facing You Escaped overlay is displayed. No additional post-victory progression, menu flow, or meta-progression is required for the capstone.</w:t>
-      </w:r>
+        <w:t>Win: Open the final door and escape the dungeon. Victory occurs when the shared doorway-crossing state confirms that the wizard has crossed to the forward side of the final door; the win condition does not implement a separate crossing detector. Once victory is confirmed, normal gameplay input — player movement, door interaction, Fireball, Frost Field, and Force Wave — stops and a simple player-facing You Escaped overlay is displayed. No additional post-victory progression, menu flow, or meta-progression is required for the capstone.</w:t>
+      </w:r>
+      <w:r/>
     </w:p>
     <w:p>
       <w:r>
         <w:rPr>
           <w:b/>
         </w:rPr>
-        <w:t>Loss:</w:t>
-      </w:r>
-      <w:r>
-        <w:t xml:space="preserve"> Reach zero health. The floor then restarts from the beginning. This is an intentional, single-attempt structure — reaching zero health at any point restarts the entire floor by design, not as a placeholder. Restart resets all run-persistent gameplay state to the floor's initial state, including player resources/cooldowns, persistent enemy objects and enemy health, pursuit/search state, Active Enemy Registry bookkeeping, door lifecycle/crossing state, encounter activation state, and player position.</w:t>
-      </w:r>
+        <w:t>Loss: Reach zero health. The floor then restarts from the beginning. This is an intentional, single-attempt structure — reaching zero health at any point restarts the entire floor by design, not as a placeholder. Restart resets all run-persistent gameplay state to the floor's initial state, including Player Health, Player Mana and its regeneration-delay state, player position/movement state, Fireball charge/cast state, Frost Field casting/active-field state, Force Wave cooldown state, persistent enemy objects and enemy health, pursuit/search/status state, Active Enemy Registry bookkeeping, door lifecycle/crossing/durability state, and encounter activation/admission state.</w:t>
+      </w:r>
+      <w:r/>
     </w:p>
     <w:p>
       <w:pPr/>
@@ -968,11 +996,9 @@
         <w:rPr>
           <w:b/>
         </w:rPr>
-        <w:t>Floor-run restart ownership:</w:t>
-      </w:r>
-      <w:r>
-        <w:t xml:space="preserve"> A shared Floor Run/Restart Orchestrator owns starting a fresh floor attempt and coordinating the reset. It does not reach into or duplicate another system's internal state. Every system that owns run-persistent state must expose a reset entry point for the state it owns, and the orchestrator invokes those owned reset interfaces. Required reset participants include Player Health, Player Mana/cooldowns, player position, enemy health/defeat state, enemy pursuit/search state, Active Enemy Registry bookkeeping, door lifecycle/crossing/durability state, and encounter activation/admission state. Early implementation may validate the orchestrator against only the persistent systems that currently exist, but full restart closure remains required work until every implemented run-persistent owner participates; adding later rooms or persistent systems must extend the reset participants without redesigning the orchestration contract.</w:t>
-      </w:r>
+        <w:t>Floor-run restart ownership: Player Health's observable zero-health/death transition triggers the shared Floor Run/Restart Orchestrator, which owns starting a fresh floor attempt and coordinating the reset. It does not reach into or duplicate another system's internal state. Every system that owns state that can persist or remain active when restart occurs must expose a reset entry point for the state it owns, and the orchestrator invokes those owned reset interfaces. Required reset participants include Player Health, Player Mana, Player Movement/player position, Fireball, Frost Field's casting-side state, Force Wave, enemy health/defeat state, enemy pursuit/search/status state, Active Enemy Registry bookkeeping, door lifecycle/crossing/durability state, and encounter activation/admission state. Early implementation may validate the orchestrator against only the persistent systems that currently exist, but full restart closure remains required work until every implemented state owner participates; adding later rooms or stateful systems must extend the reset participants without redesigning the orchestration contract.</w:t>
+      </w:r>
+      <w:r/>
     </w:p>
     <w:p>
       <w:pPr>
@@ -1286,6 +1312,18 @@
       </w:r>
     </w:p>
     <w:p>
+      <w:pPr/>
+      <w:r>
+        <w:rPr>
+          <w:b/>
+        </w:rPr>
+        <w:t>Enemy health and defeat ownership:</w:t>
+      </w:r>
+      <w:r>
+        <w:t xml:space="preserve"> A reusable Enemy Health/Defeat capability owns each persistent enemy object's current health, damage intake, defeat transition, and restartable health/defeat state. Fireball and any other canon-required damage source request damage through this owner-controlled interface rather than writing enemy health directly. When defeat occurs, the Enemy Health/Defeat owner reports that transition through the Active Enemy Registry owner's removal/unregister interface so the active count is updated without duplicating registry bookkeeping. Floor restart restores enemy health/defeat state through the enemy-owned reset entry point; the Floor Run/Restart Orchestrator does not mutate enemy-health internals directly.</w:t>
+      </w:r>
+    </w:p>
+    <w:p>
       <w:pPr>
         <w:pStyle w:val="Heading2"/>
       </w:pPr>
@@ -1485,6 +1523,20 @@
         <w:pStyle w:val="ListBullet"/>
       </w:pPr>
       <w:r>
+        <w:rPr>
+          <w:b/>
+        </w:rPr>
+        <w:t>Locked-door attack and durability ownership:</w:t>
+      </w:r>
+      <w:r>
+        <w:t xml:space="preserve"> Enemy Pursuit/attack behavior owns deciding when a qualifying blocked pursuer attacks and executing that attack attempt. Door and Interaction owns door durability, the owner-controlled door-damage receive interface, and the locked-to-broken state transition. Enemy attack code requests door damage through that interface and does not directly write door durability or semantic door state.</w:t>
+      </w:r>
+    </w:p>
+    <w:p>
+      <w:pPr>
+        <w:pStyle w:val="ListBullet"/>
+      </w:pPr>
+      <w:r>
         <w:t xml:space="preserve">If the player waits too long, the locked door breaks and the surviving group </w:t>
       </w:r>
       <w:proofErr w:type="gramStart"/>
@@ -1740,7 +1792,7 @@
     </w:p>
     <w:p>
       <w:r>
-        <w:t>Peer feedback identified that the earlier draft did not explain how the spells and room layouts produced different tactical decisions. A targeted multi-agent review then tested whether those decisions could collapse into a dominant strategy. This revision clarifies Fireball's tap-versus-charge tradeoff, Frost Field's resource commitment, Force Wave's mid-room-versus-door decision, mixed enemy compositions, persistent-pursuer priority, room-specific implementation checks, distance-based target loss and search behavior, accessible cursor-targeted door interaction, shared doorway-crossing ownership, enemy damage through Player Health, active-enemy bookkeeping, runtime ownership boundaries, Player Health restoration ownership, door-to-navigation passability prerequisites, player-experience validation obligations, visible health feedback, character SpriteRenderer ownership, approved Unity package choices, Windows build configuration ownership, failed-task retry policy, and full-run restart state without expanding the required content scope.</w:t>
+        <w:t>Peer feedback identified that the earlier draft did not explain how the spells and room layouts produced different tactical decisions. A targeted multi-agent review then tested whether those decisions could collapse into a dominant strategy. This revision clarifies Fireball's tap-versus-charge tradeoff, Frost Field's resource commitment, Force Wave's mid-room-versus-door decision, mixed enemy compositions, persistent-pursuer priority, room-specific implementation checks, distance-based target loss and search behavior, accessible cursor-targeted door interaction, shared doorway-crossing ownership, enemy damage through Player Health, active-enemy bookkeeping, runtime ownership boundaries, Player Health restoration ownership, enemy health/defeat ownership, locked-door attack-to-durability ownership, door-to-navigation passability prerequisites, player-experience validation obligations, visible health feedback, character SpriteRenderer ownership, approved Unity package choices, Windows build configuration ownership, failed-task retry policy, full-run restart state, player-subsystem/spell-state ownership, zero-health restart signaling, charged-Fireball movement-restriction ownership, and Frost Field readability without expanding the required content scope.</w:t>
       </w:r>
     </w:p>
     <w:p>
@@ -1898,7 +1950,7 @@
           </w:tcPr>
           <w:p>
             <w:r>
-              <w:t>Implements cursor-targeted door selection, arm's-reach validation, the latched five-second opening interaction, shared doorway-crossing state, closing, locking, damage, and breaking. Owns crossing detection; locking and final escape consume that shared state.</w:t>
+              <w:t>Implements cursor-targeted door selection, arm's-reach validation, the latched five-second opening interaction, interruption, shared doorway-crossing state, closing, locking, runtime door durability, the owner-controlled door-damage receive interface, and breaking. Owns crossing detection; locking and final escape consume that shared state. Enemy attack behavior requests door damage through the Door-owned interface instead of writing durability or lifecycle state directly.</w:t>
             </w:r>
           </w:p>
         </w:tc>
@@ -1908,7 +1960,7 @@
           </w:tcPr>
           <w:p>
             <w:r>
-              <w:t>Makes room exits risky and safety temporary while keeping doorway-crossing logic in one place.</w:t>
+              <w:t>Makes room exits risky and safety temporary while keeping doorway-crossing and runtime door-durability ownership in one place.</w:t>
             </w:r>
           </w:p>
         </w:tc>
@@ -1930,7 +1982,7 @@
           </w:tcPr>
           <w:p>
             <w:r>
-              <w:t>Implements enemy detection, melee and ranged attacks, pursuit, target loss/search/reacquisition, Frost slowdown apply/restore, forced displacement, and persistent enemy bookkeeping. Enemy attacks consume Player Health; locomotion consumes the shared gameplay navigation/locomotion layer. Owns the Active Enemy Registry.</w:t>
+              <w:t>Implements enemy detection, melee and ranged attacks, pursuit, target loss/search/reacquisition, Frost slowdown apply/restore, forced displacement, persistent enemy bookkeeping, and the reusable Enemy Health/Defeat capability. Enemy attacks consume Player Health; damage sources consume Enemy Health/Defeat; defeat updates the Active Enemy Registry through its interface; locomotion consumes the shared gameplay navigation/locomotion layer. Qualifying locked-door attacks request damage through the Door and Interaction interface instead of writing door durability.</w:t>
             </w:r>
           </w:p>
         </w:tc>
@@ -1940,7 +1992,7 @@
           </w:tcPr>
           <w:p>
             <w:r>
-              <w:t>Makes surviving enemies a persistent consequence without duplicating health, navigation, or active-enemy state.</w:t>
+              <w:t>Makes surviving enemies a persistent consequence while preserving explicit ownership of enemy health/defeat, navigation, registry bookkeeping, and Door-owned durability.</w:t>
             </w:r>
           </w:p>
         </w:tc>
@@ -1962,7 +2014,7 @@
           </w:tcPr>
           <w:p>
             <w:r>
-              <w:t>Authors encounter placements, triggers, door durability, and final-room pressure. Owns encounter-admission policy and consumes the Active Enemy Registry before activating new enemies; new encounter enemies are delayed or reduced first when the fifteen-enemy cap would be exceeded.</w:t>
+              <w:t>Authors encounter placements, triggers, configured per-door durability values, and final-room pressure. Owns encounter-admission policy and consumes the Active Enemy Registry before activating new enemies; new encounter enemies are delayed or reduced first when the fifteen-enemy cap would be exceeded. Runtime door durability state, damage intake, and breaking remain Door and Interaction responsibilities.</w:t>
             </w:r>
           </w:p>
         </w:tc>
@@ -1972,7 +2024,7 @@
           </w:tcPr>
           <w:p>
             <w:r>
-              <w:t>Controls encounter pressure and cap admission without owning or duplicating persistent-enemy bookkeeping.</w:t>
+              <w:t>Controls encounter pressure, cap admission, and durability tuning without owning runtime Door state or persistent-enemy bookkeeping.</w:t>
             </w:r>
           </w:p>
         </w:tc>
@@ -2037,7 +2089,7 @@
         <w:pStyle w:val="ListBullet"/>
       </w:pPr>
       <w:r>
-        <w:t>Wizard Combat Agent owns player movement/resources and spell initiation. It requests enemy effects through enemy-owned interfaces and does not directly manipulate enemy locomotion, status restoration, or forced-displacement state.</w:t>
+        <w:t>Wizard Combat Agent owns player movement/resources and spell initiation. Within that responsibility, Player Health, Player Mana, Player Movement, and each spell remain separate runtime state owners rather than collapsing their state into one shared player system. Player Health owns health and its zero-health transition; Player Mana owns mana and regeneration-delay state; Player Movement owns position/locomotion and movement-restriction state; Fireball, Frost Field, and Force Wave own their spell-local state. Charged Fireball consumes the Player Movement restriction interface instead of mutating movement internals. Spells consume Player Mana through its spend interface. Wizard Combat requests enemy effects through enemy-owned interfaces and does not directly manipulate enemy locomotion, status restoration, or forced-displacement state.</w:t>
       </w:r>
     </w:p>
     <w:p>
@@ -2045,7 +2097,7 @@
         <w:pStyle w:val="ListBullet"/>
       </w:pPr>
       <w:r>
-        <w:t>Enemy Pursuit Agent owns enemy pursuit/search state, enemy locomotion behavior, enemy attack behavior, Frost slowdown application/restoration, forced displacement, and shared Active Enemy Registry bookkeeping. Enemy attacks consume the shared Player Health damage interface, enemy locomotion consumes the shared gameplay navigation/locomotion layer, and encounter activation consumes the registry rather than maintaining a separate count. Pursuit and attack behavior consume doorway walkability from the shared navigation layer rather than directly changing NavMesh or door passability.</w:t>
+        <w:t>Enemy Pursuit Agent owns enemy pursuit/search state, enemy locomotion behavior, enemy attack behavior, the reusable Enemy Health/Defeat capability, Frost slowdown application/restoration, forced displacement, and shared Active Enemy Registry bookkeeping. Enemy attacks consume the shared Player Health damage interface; damage dealt to enemies consumes the Enemy Health/Defeat interface; defeat reports registry removal through the registry-owned interface; enemy locomotion consumes the shared gameplay navigation/locomotion layer; and encounter activation consumes the registry rather than maintaining a separate count. Qualifying locked-door attacks request damage through the Door and Interaction damage interface rather than mutating door durability or lifecycle state. Pursuit and attack behavior consume doorway walkability from the shared navigation layer rather than directly changing NavMesh or door passability.</w:t>
       </w:r>
     </w:p>
     <w:p>
@@ -2053,7 +2105,7 @@
         <w:pStyle w:val="ListBullet"/>
       </w:pPr>
       <w:r>
-        <w:t>Door and Interaction Agent owns door targeting, the latched opening interaction, shared doorway-crossing state, and semantic door lifecycle state. Other systems consume doorway-crossing state rather than implementing their own crossing detector. Door state changes are published through the shared navigation/locomotion passability interface; Door and Interaction does not own the navigation technology that translates those states into enemy walkability.</w:t>
+        <w:t>Door and Interaction Agent owns door targeting, the latched opening interaction, shared doorway-crossing state, runtime door durability, the owner-controlled door-damage receive interface, and semantic door lifecycle state including the locked-to-broken transition. Other systems consume doorway-crossing state rather than implementing their own crossing detector, and enemy attack behavior requests durability loss through the Door-owned damage interface rather than mutating Door state directly. Door state changes are published through the shared navigation/locomotion passability interface; Door and Interaction does not own the navigation technology that translates those states into enemy walkability.</w:t>
       </w:r>
     </w:p>
     <w:p>
@@ -2578,6 +2630,14 @@
         <w:pStyle w:val="ListBullet"/>
       </w:pPr>
       <w:r>
+        <w:t>A reusable Enemy Health/Defeat runtime capability owns each persistent enemy's current health, damage intake, defeat transition, and floor-restart reset. Fireball and any other canon-required enemy-damage source call that capability's damage interface. Defeat then reports removal through the Active Enemy Registry's owner-controlled interface; neither damage sources nor the restart orchestrator directly write enemy-health or registry internals.</w:t>
+      </w:r>
+    </w:p>
+    <w:p>
+      <w:pPr>
+        <w:pStyle w:val="ListBullet"/>
+      </w:pPr>
+      <w:r>
         <w:t>All five encounter spaces exist inside one continuous Unity scene or continuous floor representation. Enemy objects, enemy health, pursuit state, active-enemy bookkeeping, and door state persist naturally as the player advances between spaces; no scene-load or cross-scene state-transfer system is required.</w:t>
       </w:r>
     </w:p>
@@ -2602,7 +2662,7 @@
         <w:pStyle w:val="ListBullet"/>
       </w:pPr>
       <w:r>
-        <w:t>A reusable door component will control opening, interruption, shared doorway-crossing state, closing, locking, damage, and breaking. It records when the wizard crosses to the forward side of an opened door and exposes that state to locking and final-victory logic; those consumers do not implement separate crossing detection. Once a door is locked by the player or broken by enemies, it does not return to an earlier state.</w:t>
+        <w:t>A reusable door component will control opening, interruption, shared doorway-crossing state, closing, locking, runtime durability, the owner-controlled door-damage receive interface, and breaking. It records when the wizard crosses to the forward side of an opened door and exposes that state to locking and final-victory logic; those consumers do not implement separate crossing detection. Enemy locked-door attack behavior requests damage through the Door-owned interface, while the door component owns durability reduction and the locked-to-broken transition. Once a door is locked by the player or broken by enemies, it does not return to an earlier state.</w:t>
       </w:r>
     </w:p>
     <w:p>
@@ -2610,7 +2670,7 @@
         <w:pStyle w:val="ListBullet"/>
       </w:pPr>
       <w:r>
-        <w:t>A shared Floor Run/Restart Orchestrator coordinates a new floor attempt when player health reaches zero. It invokes reset entry points owned by each run-persistent system rather than directly mutating their internals. Player resources/position, enemy health and pursuit/search state, Active Enemy Registry bookkeeping, door lifecycle/crossing/durability state, and encounter activation/admission state must all participate once those systems exist. Early staged restart implementation is valid only as an incremental step; the persistent-systems closure remains required until all implemented run-persistent owners are connected to the orchestrator.</w:t>
+        <w:t>A shared Floor Run/Restart Orchestrator coordinates a new floor attempt when it receives Player Health's zero-health/death transition. It invokes reset entry points owned by each stateful system rather than directly mutating their internals. Player Health, Player Mana, Player Movement/player position, spell-local Fireball/Frost Field/Force Wave state, enemy health and pursuit/search/status state, Active Enemy Registry bookkeeping, door lifecycle/crossing/durability state, and encounter activation/admission state must all participate once those systems exist. Early staged restart implementation is valid only as an incremental step; the persistent-systems closure remains required until all implemented state owners are connected to the orchestrator.</w:t>
       </w:r>
     </w:p>
     <w:p>
@@ -2618,7 +2678,7 @@
         <w:pStyle w:val="ListBullet"/>
       </w:pPr>
       <w:r>
-        <w:t>Mana will regenerate through a local gameplay system after the defined post-cast delay.</w:t>
+        <w:t>Player Mana owns current mana and the post-cast regeneration-delay state and exposes an owner-controlled spend/reset interface to spells and restart orchestration. Spell-local cooldown/charge/cast/active-field state stays on the spell that owns it. Player Movement owns position/locomotion and exposes the owner-controlled movement-restriction interface consumed by Charged Fireball.</w:t>
       </w:r>
     </w:p>
     <w:p>

</xml_diff>